<commit_message>
chore: batch commit all pending local changes
</commit_message>
<xml_diff>
--- a/010 学习资料/新建 DOCX 文档.docx
+++ b/010 学习资料/新建 DOCX 文档.docx
@@ -921,27 +921,15 @@
         </w:rPr>
         <w:t xml:space="preserve"> 42 </w:t>
       </w:r>
-      <w:proofErr w:type="gramStart"/>
-      <w:r>
-        <w:rPr>
-          <w:rFonts w:ascii="Segoe UI" w:eastAsia="宋体" w:hAnsi="Segoe UI" w:cs="Segoe UI"/>
-          <w:color w:val="3C3C43"/>
-          <w:spacing w:val="-2"/>
-          <w:kern w:val="0"/>
-          <w:szCs w:val="21"/>
-        </w:rPr>
-        <w:t>个</w:t>
-      </w:r>
-      <w:proofErr w:type="gramEnd"/>
-      <w:r>
-        <w:rPr>
-          <w:rFonts w:ascii="Segoe UI" w:eastAsia="宋体" w:hAnsi="Segoe UI" w:cs="Segoe UI"/>
-          <w:color w:val="3C3C43"/>
-          <w:spacing w:val="-2"/>
-          <w:kern w:val="0"/>
-          <w:szCs w:val="21"/>
-        </w:rPr>
-        <w:t>安全更新）</w:t>
+      <w:r>
+        <w:rPr>
+          <w:rFonts w:ascii="Segoe UI" w:eastAsia="宋体" w:hAnsi="Segoe UI" w:cs="Segoe UI"/>
+          <w:color w:val="3C3C43"/>
+          <w:spacing w:val="-2"/>
+          <w:kern w:val="0"/>
+          <w:szCs w:val="21"/>
+        </w:rPr>
+        <w:t>个安全更新）</w:t>
       </w:r>
     </w:p>
     <w:p>
@@ -1222,7 +1210,7 @@
         <w:shd w:val="clear" w:color="auto" w:fill="F1F3F5"/>
         <w:jc w:val="left"/>
         <w:rPr>
-          <w:rFonts w:ascii="Segoe UI" w:eastAsia="宋体" w:hAnsi="Segoe UI" w:cs="Segoe UI" w:hint="eastAsia"/>
+          <w:rFonts w:ascii="Segoe UI" w:eastAsia="宋体" w:hAnsi="Segoe UI" w:cs="Segoe UI"/>
           <w:color w:val="3C3C43"/>
           <w:spacing w:val="-2"/>
           <w:kern w:val="0"/>
@@ -1315,27 +1303,15 @@
         </w:rPr>
         <w:t xml:space="preserve"> 42 </w:t>
       </w:r>
-      <w:proofErr w:type="gramStart"/>
-      <w:r>
-        <w:rPr>
-          <w:rFonts w:ascii="Segoe UI" w:eastAsia="宋体" w:hAnsi="Segoe UI" w:cs="Segoe UI"/>
-          <w:color w:val="3C3C43"/>
-          <w:spacing w:val="-2"/>
-          <w:kern w:val="0"/>
-          <w:szCs w:val="21"/>
-        </w:rPr>
-        <w:t>个</w:t>
-      </w:r>
-      <w:proofErr w:type="gramEnd"/>
-      <w:r>
-        <w:rPr>
-          <w:rFonts w:ascii="Segoe UI" w:eastAsia="宋体" w:hAnsi="Segoe UI" w:cs="Segoe UI"/>
-          <w:color w:val="3C3C43"/>
-          <w:spacing w:val="-2"/>
-          <w:kern w:val="0"/>
-          <w:szCs w:val="21"/>
-        </w:rPr>
-        <w:t>安全更新）</w:t>
+      <w:r>
+        <w:rPr>
+          <w:rFonts w:ascii="Segoe UI" w:eastAsia="宋体" w:hAnsi="Segoe UI" w:cs="Segoe UI"/>
+          <w:color w:val="3C3C43"/>
+          <w:spacing w:val="-2"/>
+          <w:kern w:val="0"/>
+          <w:szCs w:val="21"/>
+        </w:rPr>
+        <w:t>个安全更新）</w:t>
       </w:r>
       <w:r>
         <w:rPr>
@@ -2257,121 +2233,504 @@
         <w:t>的域名：</w:t>
       </w:r>
     </w:p>
+    <w:p>
+      <w:pPr>
+        <w:rPr>
+          <w:rFonts w:hint="eastAsia"/>
+        </w:rPr>
+      </w:pPr>
+    </w:p>
+    <w:p>
+      <w:pPr>
+        <w:rPr>
+          <w:rFonts w:hint="eastAsia"/>
+        </w:rPr>
+      </w:pPr>
+    </w:p>
+    <w:p>
+      <w:pPr>
+        <w:rPr>
+          <w:rFonts w:hint="eastAsia"/>
+        </w:rPr>
+      </w:pPr>
+    </w:p>
+    <w:p>
+      <w:pPr>
+        <w:rPr>
+          <w:rFonts w:hint="eastAsia"/>
+        </w:rPr>
+      </w:pPr>
+      <w:r>
+        <w:t>现在要上</w:t>
+      </w:r>
+      <w:proofErr w:type="gramStart"/>
+      <w:r>
+        <w:t>传项目</w:t>
+      </w:r>
+      <w:proofErr w:type="gramEnd"/>
+      <w:r>
+        <w:t>代码。我用 SSH 的方式从本地传到服务器，先</w:t>
+      </w:r>
+      <w:proofErr w:type="gramStart"/>
+      <w:r>
+        <w:t>配一下免密</w:t>
+      </w:r>
+      <w:proofErr w:type="gramEnd"/>
+      <w:r>
+        <w:t>登录。</w:t>
+      </w:r>
+    </w:p>
+    <w:p>
+      <w:pPr>
+        <w:rPr>
+          <w:rFonts w:hint="eastAsia"/>
+        </w:rPr>
+      </w:pPr>
+      <w:r>
+        <w:rPr>
+          <w:b/>
+          <w:bCs/>
+        </w:rPr>
+        <w:t>你的终端里跑这句，创建 .ssh 目录：</w:t>
+      </w:r>
+    </w:p>
+    <w:p>
+      <w:pPr>
+        <w:rPr>
+          <w:rFonts w:hint="eastAsia"/>
+        </w:rPr>
+      </w:pPr>
+      <w:r>
+        <w:t>复制</w:t>
+      </w:r>
+    </w:p>
+    <w:p>
+      <w:pPr>
+        <w:rPr>
+          <w:rFonts w:hint="eastAsia"/>
+        </w:rPr>
+      </w:pPr>
+      <w:proofErr w:type="spellStart"/>
+      <w:r>
+        <w:t>mkdir</w:t>
+      </w:r>
+      <w:proofErr w:type="spellEnd"/>
+      <w:r>
+        <w:t xml:space="preserve"> -p ~/.ssh &amp;&amp; </w:t>
+      </w:r>
+      <w:proofErr w:type="spellStart"/>
+      <w:r>
+        <w:t>chmod</w:t>
+      </w:r>
+      <w:proofErr w:type="spellEnd"/>
+      <w:r>
+        <w:t xml:space="preserve"> 700 ~/.ssh</w:t>
+      </w:r>
+    </w:p>
+    <w:p>
+      <w:pPr>
+        <w:rPr>
+          <w:rFonts w:hint="eastAsia"/>
+        </w:rPr>
+      </w:pPr>
+      <w:r>
+        <w:t>**等我一下，我在本地生成密钥：**好，密钥生成了。现在把下面这条命令复制粘贴到你的 </w:t>
+      </w:r>
+      <w:r>
+        <w:rPr>
+          <w:b/>
+          <w:bCs/>
+        </w:rPr>
+        <w:t>Workbench 终端</w:t>
+      </w:r>
+      <w:r>
+        <w:t> 里执行：</w:t>
+      </w:r>
+    </w:p>
+    <w:p>
+      <w:pPr>
+        <w:rPr>
+          <w:rFonts w:hint="eastAsia"/>
+        </w:rPr>
+      </w:pPr>
+      <w:r>
+        <w:t>复制</w:t>
+      </w:r>
+    </w:p>
+    <w:p>
+      <w:pPr>
+        <w:rPr>
+          <w:rFonts w:hint="eastAsia"/>
+        </w:rPr>
+      </w:pPr>
+      <w:r>
+        <w:t xml:space="preserve">echo 'ssh-ed25519 AAAAC3NzaC1lZDI1NTE5AAAAIB/vcU4O1xbV5RL44q5o2heztIfHDIOwjg7PPqH18d2g </w:t>
+      </w:r>
+      <w:proofErr w:type="spellStart"/>
+      <w:r>
+        <w:t>rolinks@livefuture</w:t>
+      </w:r>
+      <w:proofErr w:type="spellEnd"/>
+      <w:r>
+        <w:t>' &gt;&gt; ~/.ssh/</w:t>
+      </w:r>
+      <w:proofErr w:type="spellStart"/>
+      <w:r>
+        <w:t>authorized_keys</w:t>
+      </w:r>
+      <w:proofErr w:type="spellEnd"/>
+      <w:r>
+        <w:t xml:space="preserve"> &amp;&amp; </w:t>
+      </w:r>
+      <w:proofErr w:type="spellStart"/>
+      <w:r>
+        <w:t>chmod</w:t>
+      </w:r>
+      <w:proofErr w:type="spellEnd"/>
+      <w:r>
+        <w:t xml:space="preserve"> 600 ~/.ssh/</w:t>
+      </w:r>
+      <w:proofErr w:type="spellStart"/>
+      <w:r>
+        <w:t>authorized_keys</w:t>
+      </w:r>
+      <w:proofErr w:type="spellEnd"/>
+    </w:p>
+    <w:p>
+      <w:pPr>
+        <w:rPr>
+          <w:rFonts w:hint="eastAsia"/>
+        </w:rPr>
+      </w:pPr>
+      <w:r>
+        <w:t>然后截图给我看结果。</w:t>
+      </w:r>
+    </w:p>
     <w:p/>
     <w:p/>
     <w:p/>
-    <w:p>
-      <w:r>
-        <w:t>现在要上</w:t>
-      </w:r>
-      <w:proofErr w:type="gramStart"/>
-      <w:r>
-        <w:t>传项目</w:t>
-      </w:r>
-      <w:proofErr w:type="gramEnd"/>
-      <w:r>
-        <w:t>代码。我用 SSH 的方式从本地传到服务器，先</w:t>
-      </w:r>
-      <w:proofErr w:type="gramStart"/>
-      <w:r>
-        <w:t>配一下免密</w:t>
-      </w:r>
-      <w:proofErr w:type="gramEnd"/>
-      <w:r>
-        <w:t>登录。</w:t>
-      </w:r>
-    </w:p>
-    <w:p>
-      <w:r>
-        <w:rPr>
-          <w:b/>
-          <w:bCs/>
-        </w:rPr>
-        <w:t>你的终端里跑这句，创建 .ssh 目录：</w:t>
-      </w:r>
-    </w:p>
-    <w:p>
-      <w:r>
-        <w:t>复制</w:t>
-      </w:r>
-    </w:p>
-    <w:p>
-      <w:proofErr w:type="spellStart"/>
-      <w:r>
-        <w:t>mkdir</w:t>
-      </w:r>
-      <w:proofErr w:type="spellEnd"/>
-      <w:r>
-        <w:t xml:space="preserve"> -p ~/.ssh &amp;&amp; </w:t>
-      </w:r>
-      <w:proofErr w:type="spellStart"/>
-      <w:r>
-        <w:t>chmod</w:t>
-      </w:r>
-      <w:proofErr w:type="spellEnd"/>
-      <w:r>
-        <w:t xml:space="preserve"> 700 ~/.ssh</w:t>
-      </w:r>
-    </w:p>
-    <w:p>
-      <w:r>
-        <w:t>**等我一下，我在本地生成密钥：**好，密钥生成了。现在把下面这条命令复制粘贴到你的 </w:t>
-      </w:r>
-      <w:r>
-        <w:rPr>
-          <w:b/>
-          <w:bCs/>
-        </w:rPr>
-        <w:t>Workbench 终端</w:t>
-      </w:r>
-      <w:r>
-        <w:t> 里执行：</w:t>
-      </w:r>
-    </w:p>
-    <w:p>
-      <w:r>
-        <w:t>复制</w:t>
-      </w:r>
-    </w:p>
-    <w:p>
-      <w:r>
-        <w:t xml:space="preserve">echo 'ssh-ed25519 AAAAC3NzaC1lZDI1NTE5AAAAIB/vcU4O1xbV5RL44q5o2heztIfHDIOwjg7PPqH18d2g </w:t>
-      </w:r>
-      <w:proofErr w:type="spellStart"/>
-      <w:r>
-        <w:t>rolinks@livefuture</w:t>
-      </w:r>
-      <w:proofErr w:type="spellEnd"/>
-      <w:r>
-        <w:t>' &gt;&gt; ~/.ssh/</w:t>
-      </w:r>
-      <w:proofErr w:type="spellStart"/>
-      <w:r>
-        <w:t>authorized_keys</w:t>
-      </w:r>
-      <w:proofErr w:type="spellEnd"/>
-      <w:r>
-        <w:t xml:space="preserve"> &amp;&amp; </w:t>
-      </w:r>
-      <w:proofErr w:type="spellStart"/>
-      <w:r>
-        <w:t>chmod</w:t>
-      </w:r>
-      <w:proofErr w:type="spellEnd"/>
-      <w:r>
-        <w:t xml:space="preserve"> 600 ~/.ssh/</w:t>
-      </w:r>
-      <w:proofErr w:type="spellStart"/>
-      <w:r>
-        <w:t>authorized_keys</w:t>
-      </w:r>
-      <w:proofErr w:type="spellEnd"/>
-    </w:p>
-    <w:p>
-      <w:r>
-        <w:t>然后截图给我看结果。</w:t>
-      </w:r>
-    </w:p>
+    <w:p/>
+    <w:p/>
+    <w:p>
+      <w:r>
+        <w:br/>
+        <w:t>实例信息</w:t>
+      </w:r>
+    </w:p>
+    <w:p>
+      <w:r>
+        <w:t>配置信息</w:t>
+      </w:r>
+    </w:p>
+    <w:p>
+      <w:r>
+        <w:t>登录信息</w:t>
+      </w:r>
+    </w:p>
+    <w:tbl>
+      <w:tblPr>
+        <w:tblW w:w="4500" w:type="dxa"/>
+        <w:tblCellSpacing w:w="15" w:type="dxa"/>
+        <w:tblCellMar>
+          <w:top w:w="15" w:type="dxa"/>
+          <w:left w:w="15" w:type="dxa"/>
+          <w:bottom w:w="15" w:type="dxa"/>
+          <w:right w:w="15" w:type="dxa"/>
+        </w:tblCellMar>
+        <w:tblLook w:val="04A0" w:firstRow="1" w:lastRow="0" w:firstColumn="1" w:lastColumn="0" w:noHBand="0" w:noVBand="1"/>
+      </w:tblPr>
+      <w:tblGrid>
+        <w:gridCol w:w="1280"/>
+        <w:gridCol w:w="3220"/>
+      </w:tblGrid>
+      <w:tr>
+        <w:trPr>
+          <w:tblCellSpacing w:w="15" w:type="dxa"/>
+        </w:trPr>
+        <w:tc>
+          <w:tcPr>
+            <w:tcW w:w="0" w:type="auto"/>
+            <w:vAlign w:val="center"/>
+            <w:hideMark/>
+          </w:tcPr>
+          <w:p>
+            <w:pPr>
+              <w:rPr>
+                <w:b/>
+                <w:bCs/>
+              </w:rPr>
+            </w:pPr>
+            <w:r>
+              <w:rPr>
+                <w:b/>
+                <w:bCs/>
+              </w:rPr>
+              <w:t>地域ID:</w:t>
+            </w:r>
+          </w:p>
+        </w:tc>
+        <w:tc>
+          <w:tcPr>
+            <w:tcW w:w="0" w:type="auto"/>
+            <w:vAlign w:val="center"/>
+            <w:hideMark/>
+          </w:tcPr>
+          <w:p>
+            <w:proofErr w:type="spellStart"/>
+            <w:r>
+              <w:t>cn</w:t>
+            </w:r>
+            <w:proofErr w:type="spellEnd"/>
+            <w:r>
+              <w:t>-shanghai</w:t>
+            </w:r>
+          </w:p>
+        </w:tc>
+      </w:tr>
+      <w:tr>
+        <w:trPr>
+          <w:tblCellSpacing w:w="15" w:type="dxa"/>
+        </w:trPr>
+        <w:tc>
+          <w:tcPr>
+            <w:tcW w:w="0" w:type="auto"/>
+            <w:vAlign w:val="center"/>
+            <w:hideMark/>
+          </w:tcPr>
+          <w:p>
+            <w:pPr>
+              <w:rPr>
+                <w:b/>
+                <w:bCs/>
+              </w:rPr>
+            </w:pPr>
+            <w:r>
+              <w:rPr>
+                <w:b/>
+                <w:bCs/>
+              </w:rPr>
+              <w:t>所在区域:</w:t>
+            </w:r>
+          </w:p>
+        </w:tc>
+        <w:tc>
+          <w:tcPr>
+            <w:tcW w:w="0" w:type="auto"/>
+            <w:vAlign w:val="center"/>
+            <w:hideMark/>
+          </w:tcPr>
+          <w:p>
+            <w:r>
+              <w:t>华东2(上海)</w:t>
+            </w:r>
+          </w:p>
+        </w:tc>
+      </w:tr>
+      <w:tr>
+        <w:trPr>
+          <w:tblCellSpacing w:w="15" w:type="dxa"/>
+        </w:trPr>
+        <w:tc>
+          <w:tcPr>
+            <w:tcW w:w="0" w:type="auto"/>
+            <w:vAlign w:val="center"/>
+            <w:hideMark/>
+          </w:tcPr>
+          <w:p>
+            <w:pPr>
+              <w:rPr>
+                <w:b/>
+                <w:bCs/>
+              </w:rPr>
+            </w:pPr>
+            <w:r>
+              <w:rPr>
+                <w:b/>
+                <w:bCs/>
+              </w:rPr>
+              <w:t>实例ID:</w:t>
+            </w:r>
+          </w:p>
+        </w:tc>
+        <w:tc>
+          <w:tcPr>
+            <w:tcW w:w="0" w:type="auto"/>
+            <w:vAlign w:val="center"/>
+            <w:hideMark/>
+          </w:tcPr>
+          <w:p>
+            <w:r>
+              <w:t>i-uf61gpktwo4kt3xf09pz</w:t>
+            </w:r>
+          </w:p>
+        </w:tc>
+      </w:tr>
+      <w:tr>
+        <w:trPr>
+          <w:tblCellSpacing w:w="15" w:type="dxa"/>
+        </w:trPr>
+        <w:tc>
+          <w:tcPr>
+            <w:tcW w:w="0" w:type="auto"/>
+            <w:vAlign w:val="center"/>
+            <w:hideMark/>
+          </w:tcPr>
+          <w:p>
+            <w:pPr>
+              <w:rPr>
+                <w:b/>
+                <w:bCs/>
+              </w:rPr>
+            </w:pPr>
+            <w:r>
+              <w:rPr>
+                <w:b/>
+                <w:bCs/>
+              </w:rPr>
+              <w:t>实例名称:</w:t>
+            </w:r>
+          </w:p>
+        </w:tc>
+        <w:tc>
+          <w:tcPr>
+            <w:tcW w:w="0" w:type="auto"/>
+            <w:vAlign w:val="center"/>
+            <w:hideMark/>
+          </w:tcPr>
+          <w:p>
+            <w:r>
+              <w:t>iZuf61gpktwo4kt3xf09pzZ</w:t>
+            </w:r>
+          </w:p>
+        </w:tc>
+      </w:tr>
+      <w:tr>
+        <w:trPr>
+          <w:tblCellSpacing w:w="15" w:type="dxa"/>
+        </w:trPr>
+        <w:tc>
+          <w:tcPr>
+            <w:tcW w:w="0" w:type="auto"/>
+            <w:vAlign w:val="center"/>
+            <w:hideMark/>
+          </w:tcPr>
+          <w:p>
+            <w:pPr>
+              <w:rPr>
+                <w:b/>
+                <w:bCs/>
+              </w:rPr>
+            </w:pPr>
+            <w:r>
+              <w:rPr>
+                <w:b/>
+                <w:bCs/>
+              </w:rPr>
+              <w:t>主机名:</w:t>
+            </w:r>
+          </w:p>
+        </w:tc>
+        <w:tc>
+          <w:tcPr>
+            <w:tcW w:w="0" w:type="auto"/>
+            <w:vAlign w:val="center"/>
+            <w:hideMark/>
+          </w:tcPr>
+          <w:p>
+            <w:r>
+              <w:t>iZuf61gpktwo4kt3xf09pzZ</w:t>
+            </w:r>
+          </w:p>
+        </w:tc>
+      </w:tr>
+      <w:tr>
+        <w:trPr>
+          <w:tblCellSpacing w:w="15" w:type="dxa"/>
+        </w:trPr>
+        <w:tc>
+          <w:tcPr>
+            <w:tcW w:w="0" w:type="auto"/>
+            <w:vAlign w:val="center"/>
+            <w:hideMark/>
+          </w:tcPr>
+          <w:p>
+            <w:pPr>
+              <w:rPr>
+                <w:b/>
+                <w:bCs/>
+              </w:rPr>
+            </w:pPr>
+            <w:r>
+              <w:rPr>
+                <w:b/>
+                <w:bCs/>
+              </w:rPr>
+              <w:t>公网IP:</w:t>
+            </w:r>
+          </w:p>
+        </w:tc>
+        <w:tc>
+          <w:tcPr>
+            <w:tcW w:w="0" w:type="auto"/>
+            <w:vAlign w:val="center"/>
+            <w:hideMark/>
+          </w:tcPr>
+          <w:p>
+            <w:r>
+              <w:t>8.133.203.255</w:t>
+            </w:r>
+          </w:p>
+        </w:tc>
+      </w:tr>
+      <w:tr>
+        <w:trPr>
+          <w:tblCellSpacing w:w="15" w:type="dxa"/>
+        </w:trPr>
+        <w:tc>
+          <w:tcPr>
+            <w:tcW w:w="0" w:type="auto"/>
+            <w:vAlign w:val="center"/>
+            <w:hideMark/>
+          </w:tcPr>
+          <w:p>
+            <w:pPr>
+              <w:rPr>
+                <w:b/>
+                <w:bCs/>
+              </w:rPr>
+            </w:pPr>
+            <w:proofErr w:type="gramStart"/>
+            <w:r>
+              <w:rPr>
+                <w:b/>
+                <w:bCs/>
+              </w:rPr>
+              <w:t>私网</w:t>
+            </w:r>
+            <w:proofErr w:type="gramEnd"/>
+            <w:r>
+              <w:rPr>
+                <w:b/>
+                <w:bCs/>
+              </w:rPr>
+              <w:t>IP:</w:t>
+            </w:r>
+          </w:p>
+        </w:tc>
+        <w:tc>
+          <w:tcPr>
+            <w:tcW w:w="0" w:type="auto"/>
+            <w:vAlign w:val="center"/>
+            <w:hideMark/>
+          </w:tcPr>
+          <w:p>
+            <w:r>
+              <w:t>172.19.180.231</w:t>
+            </w:r>
+          </w:p>
+        </w:tc>
+      </w:tr>
+    </w:tbl>
     <w:p>
       <w:pPr>
         <w:rPr>

</xml_diff>